<commit_message>
docs: rà soát 897 — TB 597/TB-CĐKT đã xác minh trong kho 02 (tệp chuẩn hóa tên), cập nhật báo cáo, hồ sơ vòng 6
Co-Authored-By: Claude Opus 5.5 <noreply@anthropic.com>
</commit_message>
<xml_diff>
--- a/30-Ket-Qua/2026-09-29/Ho-So-Tham-Dinh-Vong-6/3-Ra-soat-897/BAO-CAO-RA-SOAT-897-CHINH-THUC_Ho-so-KTC-Quan-tri-gui-tham-dinh_20260929.docx
+++ b/30-Ket-Qua/2026-09-29/Ho-So-Tham-Dinh-Vong-6/3-Ra-soat-897/BAO-CAO-RA-SOAT-897-CHINH-THUC_Ho-so-KTC-Quan-tri-gui-tham-dinh_20260929.docx
@@ -538,7 +538,7 @@
                 <w:i w:val="0"/>
                 <w:sz w:val="26"/>
               </w:rPr>
-              <w:t>Kho 01: Thông tư số 49/2026/TT-BGDĐT; Nghị định số 334/2026/NĐ-CP. Kho 02: Quyết định số 1976/QĐ-CĐKT (bản HIỆN HÀNH), 1923/QĐ-CĐKT, 2119/QĐ-CĐKT; Thông báo số 736/TB-CĐKT, 817/TB-CĐKT, 1052/TB-CĐKT, 1056/TB-CĐKT. Kho 04: Thông báo số 736/TB-CĐKT (bản tương đồng)</w:t>
+              <w:t>Kho 01: Thông tư số 49/2026/TT-BGDĐT; Nghị định số 334/2026/NĐ-CP. Kho 02: Quyết định số 1976/QĐ-CĐKT (bản HIỆN HÀNH), 1923/QĐ-CĐKT, 2119/QĐ-CĐKT; Thông báo số 736/TB-CĐKT, 817/TB-CĐKT, 1052/TB-CĐKT, 1056/TB-CĐKT, 597/TB-CĐKT (xác minh lại sau khi tệp được chuẩn hóa tên). Kho 04: Thông báo số 736/TB-CĐKT (bản tương đồng)</w:t>
             </w:r>
           </w:p>
         </w:tc>
@@ -601,7 +601,7 @@
                 <w:i w:val="0"/>
                 <w:sz w:val="26"/>
               </w:rPr>
-              <w:t>Kế hoạch số 848/KH-CĐKT, Thông báo số 917/TB-CĐKT, 924/TB-CĐKT, 948/TB-CĐKT: Đối chiếu bản gốc do người phụ trách cung cấp (10-Dau-Vao, đề xuất nạp kho ngày 27/9/2026) — khớp số, ngày, trích yếu. Thông báo số 597/TB-CĐKT: Không tìm thấy bản gốc (chỉ có trích dẫn trong Checklist 08). Không tra Internet: Văn bản nội bộ, không có nguồn chính thống trên mạng</w:t>
+              <w:t>Kế hoạch số 848/KH-CĐKT, Thông báo số 917/TB-CĐKT, 924/TB-CĐKT, 948/TB-CĐKT: Đối chiếu bản gốc do người phụ trách cung cấp (10-Dau-Vao, đề xuất nạp kho ngày 27/9/2026) — khớp số, ngày, trích yếu. Không tra Internet: Văn bản nội bộ, không có nguồn chính thống trên mạng</w:t>
             </w:r>
           </w:p>
         </w:tc>
@@ -4008,7 +4008,7 @@
                 <w:i w:val="0"/>
                 <w:sz w:val="26"/>
               </w:rPr>
-              <w:t>Không tìm thấy bản gốc ở kho 01 - 04 và thư mục dự án; chỉ có trích dẫn trong Checklist 08 của bộ quy tắc 897</w:t>
+              <w:t>Lần quét đầu không tìm thấy: Tệp gốc trong kho 02 đặt tên không có số hiệu (“01. Thong bao huong dan the thuc…”)</w:t>
             </w:r>
           </w:p>
         </w:tc>
@@ -4094,7 +4094,7 @@
                 <w:i w:val="0"/>
                 <w:sz w:val="26"/>
               </w:rPr>
-              <w:t>Nạp bản gốc vào kho 02 để đối chiếu</w:t>
+              <w:t>Chuẩn hóa tên tệp trong kho, đối chiếu lại</w:t>
             </w:r>
           </w:p>
           <w:p>
@@ -4110,7 +4110,7 @@
                 <w:color w:val="FF0000"/>
                 <w:sz w:val="26"/>
               </w:rPr>
-              <w:t>Phản hồi: CẦN XÁC MINH</w:t>
+              <w:t>Phản hồi: Đã xác minh 29/9/2026: Tệp đã chuẩn hóa tên (TB-597-TB-CDKT_…_20260519_v1.docx), khớp số, ngày 19/5/2026, trích yếu — không phải sửa văn bản</w:t>
             </w:r>
           </w:p>
         </w:tc>
@@ -5406,7 +5406,7 @@
                 <w:i w:val="0"/>
                 <w:sz w:val="26"/>
               </w:rPr>
-              <w:t>0</w:t>
+              <w:t>1</w:t>
             </w:r>
           </w:p>
         </w:tc>
@@ -5435,7 +5435,7 @@
                 <w:i w:val="0"/>
                 <w:sz w:val="26"/>
               </w:rPr>
-              <w:t>5</w:t>
+              <w:t>4</w:t>
             </w:r>
           </w:p>
         </w:tc>
@@ -5464,7 +5464,7 @@
                 <w:i w:val="0"/>
                 <w:sz w:val="26"/>
               </w:rPr>
-              <w:t>Góp ý, cần xác minh nguồn; không chặn gửi thẩm định</w:t>
+              <w:t>M4-03 đã xác minh; còn lại là góp ý, việc nạp kho — không chặn gửi thẩm định</w:t>
             </w:r>
           </w:p>
         </w:tc>
@@ -5597,7 +5597,7 @@
           <w:i w:val="0"/>
           <w:sz w:val="28"/>
         </w:rPr>
-        <w:t>- Thứ tự xử lý Mức 4: (1) người quản lý kho nạp Kế hoạch số 848/KH-CĐKT, Thông báo số 917, 924, 948/TB-CĐKT và bản gốc Thông báo số 597/TB-CĐKT vào kho 02; (2) người ký quyết định thứ tự căn cứ M4-01.</w:t>
+        <w:t>- Thứ tự xử lý Mức 4: (1) người quản lý kho nạp Kế hoạch số 848/KH-CĐKT, Thông báo số 917, 924, 948/TB-CĐKT vào kho 02; (2) người ký quyết định thứ tự căn cứ M4-01.</w:t>
       </w:r>
     </w:p>
     <w:p>
@@ -6227,7 +6227,7 @@
                 <w:i w:val="0"/>
                 <w:sz w:val="26"/>
               </w:rPr>
-              <w:t>Kho KTC-Database 01 (Thông tư số 49/2026/TT-BGDĐT, Nghị định số 334/2026/NĐ-CP), 02 (Quyết định số 1976, 1923, 2119/QĐ-CĐKT; Thông báo số 736, 817, 1052, 1056/TB-CĐKT), 04 (Thông báo số 736/TB-CĐKT); bản gốc Kế hoạch số 848/KH-CĐKT, Thông báo số 917, 924, 948/TB-CĐKT do người phụ trách cung cấp; bộ quy tắc KTC-Ra-Soat-897 (Core v3.0, baseline v2.24, Checklist 01 - 05, 08); 4 văn bản rà soát</w:t>
+              <w:t>Kho KTC-Database 01 (Thông tư số 49/2026/TT-BGDĐT, Nghị định số 334/2026/NĐ-CP), 02 (Quyết định số 1976, 1923, 2119/QĐ-CĐKT; Thông báo số 597, 736, 817, 1052, 1056/TB-CĐKT), 04 (Thông báo số 736/TB-CĐKT); bản gốc Kế hoạch số 848/KH-CĐKT, Thông báo số 917, 924, 948/TB-CĐKT do người phụ trách cung cấp; bộ quy tắc KTC-Ra-Soat-897 (Core v3.0, baseline v2.24, Checklist 01 - 05, 08); 4 văn bản rà soát</w:t>
             </w:r>
           </w:p>
         </w:tc>

</xml_diff>

<commit_message>
docs: sửa 4 văn bản hồ sơ vòng 6 theo Checklist 08 (quy ước riêng của Trường) — viện dẫn lần sau, mục lục HD
Co-Authored-By: Claude Opus 5.5 <noreply@anthropic.com>
</commit_message>
<xml_diff>
--- a/30-Ket-Qua/2026-09-29/Ho-So-Tham-Dinh-Vong-6/3-Ra-soat-897/BAO-CAO-RA-SOAT-897-CHINH-THUC_Ho-so-KTC-Quan-tri-gui-tham-dinh_20260929.docx
+++ b/30-Ket-Qua/2026-09-29/Ho-So-Tham-Dinh-Vong-6/3-Ra-soat-897/BAO-CAO-RA-SOAT-897-CHINH-THUC_Ho-so-KTC-Quan-tri-gui-tham-dinh_20260929.docx
@@ -3475,6 +3475,452 @@
                 <w:i w:val="0"/>
                 <w:sz w:val="26"/>
               </w:rPr>
+              <w:t>M3-09</w:t>
+            </w:r>
+          </w:p>
+        </w:tc>
+        <w:tc>
+          <w:tcPr>
+            <w:tcW w:type="dxa" w:w="1814"/>
+            <w:vAlign w:val="top"/>
+            <w:tcMar>
+              <w:top w:w="60" w:type="dxa"/>
+              <w:start w:w="90" w:type="dxa"/>
+              <w:bottom w:w="60" w:type="dxa"/>
+              <w:end w:w="90" w:type="dxa"/>
+            </w:tcMar>
+          </w:tcPr>
+          <w:p>
+            <w:pPr>
+              <w:spacing w:after="0" w:line="240" w:lineRule="auto"/>
+              <w:ind w:firstLine="0" w:left="0"/>
+              <w:jc w:val="both"/>
+            </w:pPr>
+            <w:r/>
+            <w:r>
+              <w:rPr>
+                <w:rFonts w:ascii="Times New Roman" w:hAnsi="Times New Roman"/>
+                <w:b w:val="0"/>
+                <w:i w:val="0"/>
+                <w:sz w:val="26"/>
+              </w:rPr>
+              <w:t>(2) Bảng Phần I, II.1, câu lệnh mẫu VI.1, VI.2, VI.8, Phần VII; (3) Mục 3 bước 1</w:t>
+            </w:r>
+          </w:p>
+        </w:tc>
+        <w:tc>
+          <w:tcPr>
+            <w:tcW w:type="dxa" w:w="2665"/>
+            <w:vAlign w:val="top"/>
+            <w:tcMar>
+              <w:top w:w="60" w:type="dxa"/>
+              <w:start w:w="90" w:type="dxa"/>
+              <w:bottom w:w="60" w:type="dxa"/>
+              <w:end w:w="90" w:type="dxa"/>
+            </w:tcMar>
+          </w:tcPr>
+          <w:p>
+            <w:pPr>
+              <w:spacing w:after="0" w:line="240" w:lineRule="auto"/>
+              <w:ind w:firstLine="0" w:left="0"/>
+              <w:jc w:val="both"/>
+            </w:pPr>
+            <w:r/>
+            <w:r>
+              <w:rPr>
+                <w:rFonts w:ascii="Times New Roman" w:hAnsi="Times New Roman"/>
+                <w:b w:val="0"/>
+                <w:i w:val="0"/>
+                <w:sz w:val="26"/>
+              </w:rPr>
+              <w:t>“mẫu Phụ lục TB 736”, “theo TB 817”, “TB 1052” (12 vị trí)</w:t>
+            </w:r>
+          </w:p>
+        </w:tc>
+        <w:tc>
+          <w:tcPr>
+            <w:tcW w:type="dxa" w:w="2608"/>
+            <w:vAlign w:val="top"/>
+            <w:tcMar>
+              <w:top w:w="60" w:type="dxa"/>
+              <w:start w:w="90" w:type="dxa"/>
+              <w:bottom w:w="60" w:type="dxa"/>
+              <w:end w:w="90" w:type="dxa"/>
+            </w:tcMar>
+          </w:tcPr>
+          <w:p>
+            <w:pPr>
+              <w:spacing w:after="0" w:line="240" w:lineRule="auto"/>
+              <w:ind w:firstLine="0" w:left="0"/>
+              <w:jc w:val="both"/>
+            </w:pPr>
+            <w:r/>
+            <w:r>
+              <w:rPr>
+                <w:rFonts w:ascii="Times New Roman" w:hAnsi="Times New Roman"/>
+                <w:b w:val="0"/>
+                <w:i w:val="0"/>
+                <w:sz w:val="26"/>
+              </w:rPr>
+              <w:t>Viện dẫn lần sau viết tắt tên loại văn bản, không ghi ký hiệu</w:t>
+            </w:r>
+          </w:p>
+        </w:tc>
+        <w:tc>
+          <w:tcPr>
+            <w:tcW w:type="dxa" w:w="2041"/>
+            <w:vAlign w:val="top"/>
+            <w:tcMar>
+              <w:top w:w="60" w:type="dxa"/>
+              <w:start w:w="90" w:type="dxa"/>
+              <w:bottom w:w="60" w:type="dxa"/>
+              <w:end w:w="90" w:type="dxa"/>
+            </w:tcMar>
+          </w:tcPr>
+          <w:p>
+            <w:pPr>
+              <w:spacing w:after="0" w:line="240" w:lineRule="auto"/>
+              <w:ind w:firstLine="0" w:left="0"/>
+              <w:jc w:val="both"/>
+            </w:pPr>
+            <w:r/>
+            <w:r>
+              <w:rPr>
+                <w:rFonts w:ascii="Times New Roman" w:hAnsi="Times New Roman"/>
+                <w:b w:val="0"/>
+                <w:i w:val="0"/>
+                <w:sz w:val="26"/>
+              </w:rPr>
+              <w:t>Checklist 08 mục 5.4 (quy ước riêng của Trường)</w:t>
+            </w:r>
+          </w:p>
+        </w:tc>
+        <w:tc>
+          <w:tcPr>
+            <w:tcW w:type="dxa" w:w="1021"/>
+            <w:vAlign w:val="top"/>
+            <w:tcMar>
+              <w:top w:w="60" w:type="dxa"/>
+              <w:start w:w="90" w:type="dxa"/>
+              <w:bottom w:w="60" w:type="dxa"/>
+              <w:end w:w="90" w:type="dxa"/>
+            </w:tcMar>
+          </w:tcPr>
+          <w:p>
+            <w:pPr>
+              <w:spacing w:after="0" w:line="240" w:lineRule="auto"/>
+              <w:ind w:firstLine="0" w:left="0"/>
+              <w:jc w:val="center"/>
+            </w:pPr>
+            <w:r/>
+            <w:r>
+              <w:rPr>
+                <w:rFonts w:ascii="Times New Roman" w:hAnsi="Times New Roman"/>
+                <w:b w:val="0"/>
+                <w:i w:val="0"/>
+                <w:sz w:val="26"/>
+              </w:rPr>
+              <w:t>Mức 3</w:t>
+            </w:r>
+          </w:p>
+        </w:tc>
+        <w:tc>
+          <w:tcPr>
+            <w:tcW w:type="dxa" w:w="3515"/>
+            <w:vAlign w:val="top"/>
+            <w:tcMar>
+              <w:top w:w="60" w:type="dxa"/>
+              <w:start w:w="90" w:type="dxa"/>
+              <w:bottom w:w="60" w:type="dxa"/>
+              <w:end w:w="90" w:type="dxa"/>
+            </w:tcMar>
+          </w:tcPr>
+          <w:p>
+            <w:pPr>
+              <w:spacing w:after="0" w:before="0" w:line="240" w:lineRule="auto"/>
+              <w:jc w:val="both"/>
+            </w:pPr>
+            <w:r/>
+            <w:r>
+              <w:rPr>
+                <w:rFonts w:ascii="Times New Roman" w:hAnsi="Times New Roman"/>
+                <w:b w:val="0"/>
+                <w:i w:val="0"/>
+                <w:sz w:val="26"/>
+              </w:rPr>
+              <w:t>“Thông báo số 736/TB-CĐKT”, “Thông báo số 817/TB-CĐKT”, “Thông báo số 1052/TB-CĐKT”</w:t>
+            </w:r>
+          </w:p>
+          <w:p>
+            <w:pPr>
+              <w:spacing w:after="0" w:before="80" w:line="240" w:lineRule="auto"/>
+              <w:jc w:val="both"/>
+            </w:pPr>
+            <w:r>
+              <w:rPr>
+                <w:rFonts w:ascii="Times New Roman" w:hAnsi="Times New Roman"/>
+                <w:b w:val="0"/>
+                <w:i w:val="0"/>
+                <w:color w:val="FF0000"/>
+                <w:sz w:val="26"/>
+              </w:rPr>
+              <w:t>Phản hồi: Đã sửa (tác giả “Sửa theo Checklist 08 quy ước Trường”)</w:t>
+            </w:r>
+          </w:p>
+        </w:tc>
+      </w:tr>
+      <w:tr>
+        <w:trPr>
+          <w:cantSplit w:val="0"/>
+        </w:trPr>
+        <w:tc>
+          <w:tcPr>
+            <w:tcW w:type="dxa" w:w="907"/>
+            <w:vAlign w:val="top"/>
+            <w:tcMar>
+              <w:top w:w="60" w:type="dxa"/>
+              <w:start w:w="90" w:type="dxa"/>
+              <w:bottom w:w="60" w:type="dxa"/>
+              <w:end w:w="90" w:type="dxa"/>
+            </w:tcMar>
+          </w:tcPr>
+          <w:p>
+            <w:pPr>
+              <w:spacing w:after="0" w:line="240" w:lineRule="auto"/>
+              <w:ind w:firstLine="0" w:left="0"/>
+              <w:jc w:val="center"/>
+            </w:pPr>
+            <w:r/>
+            <w:r>
+              <w:rPr>
+                <w:rFonts w:ascii="Times New Roman" w:hAnsi="Times New Roman"/>
+                <w:b w:val="0"/>
+                <w:i w:val="0"/>
+                <w:sz w:val="26"/>
+              </w:rPr>
+              <w:t>M3-10</w:t>
+            </w:r>
+          </w:p>
+        </w:tc>
+        <w:tc>
+          <w:tcPr>
+            <w:tcW w:type="dxa" w:w="1814"/>
+            <w:vAlign w:val="top"/>
+            <w:tcMar>
+              <w:top w:w="60" w:type="dxa"/>
+              <w:start w:w="90" w:type="dxa"/>
+              <w:bottom w:w="60" w:type="dxa"/>
+              <w:end w:w="90" w:type="dxa"/>
+            </w:tcMar>
+          </w:tcPr>
+          <w:p>
+            <w:pPr>
+              <w:spacing w:after="0" w:line="240" w:lineRule="auto"/>
+              <w:ind w:firstLine="0" w:left="0"/>
+              <w:jc w:val="both"/>
+            </w:pPr>
+            <w:r/>
+            <w:r>
+              <w:rPr>
+                <w:rFonts w:ascii="Times New Roman" w:hAnsi="Times New Roman"/>
+                <w:b w:val="0"/>
+                <w:i w:val="0"/>
+                <w:sz w:val="26"/>
+              </w:rPr>
+              <w:t>(3) Mục 7, hồ sơ kèm theo (2 vị trí)</w:t>
+            </w:r>
+          </w:p>
+        </w:tc>
+        <w:tc>
+          <w:tcPr>
+            <w:tcW w:type="dxa" w:w="2665"/>
+            <w:vAlign w:val="top"/>
+            <w:tcMar>
+              <w:top w:w="60" w:type="dxa"/>
+              <w:start w:w="90" w:type="dxa"/>
+              <w:bottom w:w="60" w:type="dxa"/>
+              <w:end w:w="90" w:type="dxa"/>
+            </w:tcMar>
+          </w:tcPr>
+          <w:p>
+            <w:pPr>
+              <w:spacing w:after="0" w:line="240" w:lineRule="auto"/>
+              <w:ind w:firstLine="0" w:left="0"/>
+              <w:jc w:val="both"/>
+            </w:pPr>
+            <w:r/>
+            <w:r>
+              <w:rPr>
+                <w:rFonts w:ascii="Times New Roman" w:hAnsi="Times New Roman"/>
+                <w:b w:val="0"/>
+                <w:i w:val="0"/>
+                <w:sz w:val="26"/>
+              </w:rPr>
+              <w:t>“Quyết định số 2119/QĐ-CĐKT ngày 28/9/2026” ở lần nhắc thứ ba, thứ tư</w:t>
+            </w:r>
+          </w:p>
+        </w:tc>
+        <w:tc>
+          <w:tcPr>
+            <w:tcW w:type="dxa" w:w="2608"/>
+            <w:vAlign w:val="top"/>
+            <w:tcMar>
+              <w:top w:w="60" w:type="dxa"/>
+              <w:start w:w="90" w:type="dxa"/>
+              <w:bottom w:w="60" w:type="dxa"/>
+              <w:end w:w="90" w:type="dxa"/>
+            </w:tcMar>
+          </w:tcPr>
+          <w:p>
+            <w:pPr>
+              <w:spacing w:after="0" w:line="240" w:lineRule="auto"/>
+              <w:ind w:firstLine="0" w:left="0"/>
+              <w:jc w:val="both"/>
+            </w:pPr>
+            <w:r/>
+            <w:r>
+              <w:rPr>
+                <w:rFonts w:ascii="Times New Roman" w:hAnsi="Times New Roman"/>
+                <w:b w:val="0"/>
+                <w:i w:val="0"/>
+                <w:sz w:val="26"/>
+              </w:rPr>
+              <w:t>Viện dẫn lần sau nhắc lại ngày ban hành</w:t>
+            </w:r>
+          </w:p>
+        </w:tc>
+        <w:tc>
+          <w:tcPr>
+            <w:tcW w:type="dxa" w:w="2041"/>
+            <w:vAlign w:val="top"/>
+            <w:tcMar>
+              <w:top w:w="60" w:type="dxa"/>
+              <w:start w:w="90" w:type="dxa"/>
+              <w:bottom w:w="60" w:type="dxa"/>
+              <w:end w:w="90" w:type="dxa"/>
+            </w:tcMar>
+          </w:tcPr>
+          <w:p>
+            <w:pPr>
+              <w:spacing w:after="0" w:line="240" w:lineRule="auto"/>
+              <w:ind w:firstLine="0" w:left="0"/>
+              <w:jc w:val="both"/>
+            </w:pPr>
+            <w:r/>
+            <w:r>
+              <w:rPr>
+                <w:rFonts w:ascii="Times New Roman" w:hAnsi="Times New Roman"/>
+                <w:b w:val="0"/>
+                <w:i w:val="0"/>
+                <w:sz w:val="26"/>
+              </w:rPr>
+              <w:t>Checklist 08 mục 5.4</w:t>
+            </w:r>
+          </w:p>
+        </w:tc>
+        <w:tc>
+          <w:tcPr>
+            <w:tcW w:type="dxa" w:w="1021"/>
+            <w:vAlign w:val="top"/>
+            <w:tcMar>
+              <w:top w:w="60" w:type="dxa"/>
+              <w:start w:w="90" w:type="dxa"/>
+              <w:bottom w:w="60" w:type="dxa"/>
+              <w:end w:w="90" w:type="dxa"/>
+            </w:tcMar>
+          </w:tcPr>
+          <w:p>
+            <w:pPr>
+              <w:spacing w:after="0" w:line="240" w:lineRule="auto"/>
+              <w:ind w:firstLine="0" w:left="0"/>
+              <w:jc w:val="center"/>
+            </w:pPr>
+            <w:r/>
+            <w:r>
+              <w:rPr>
+                <w:rFonts w:ascii="Times New Roman" w:hAnsi="Times New Roman"/>
+                <w:b w:val="0"/>
+                <w:i w:val="0"/>
+                <w:sz w:val="26"/>
+              </w:rPr>
+              <w:t>Mức 3</w:t>
+            </w:r>
+          </w:p>
+        </w:tc>
+        <w:tc>
+          <w:tcPr>
+            <w:tcW w:type="dxa" w:w="3515"/>
+            <w:vAlign w:val="top"/>
+            <w:tcMar>
+              <w:top w:w="60" w:type="dxa"/>
+              <w:start w:w="90" w:type="dxa"/>
+              <w:bottom w:w="60" w:type="dxa"/>
+              <w:end w:w="90" w:type="dxa"/>
+            </w:tcMar>
+          </w:tcPr>
+          <w:p>
+            <w:pPr>
+              <w:spacing w:after="0" w:before="0" w:line="240" w:lineRule="auto"/>
+              <w:jc w:val="both"/>
+            </w:pPr>
+            <w:r/>
+            <w:r>
+              <w:rPr>
+                <w:rFonts w:ascii="Times New Roman" w:hAnsi="Times New Roman"/>
+                <w:b w:val="0"/>
+                <w:i w:val="0"/>
+                <w:sz w:val="26"/>
+              </w:rPr>
+              <w:t>Lần sau chỉ ghi tên loại và số, ký hiệu</w:t>
+            </w:r>
+          </w:p>
+          <w:p>
+            <w:pPr>
+              <w:spacing w:after="0" w:before="80" w:line="240" w:lineRule="auto"/>
+              <w:jc w:val="both"/>
+            </w:pPr>
+            <w:r>
+              <w:rPr>
+                <w:rFonts w:ascii="Times New Roman" w:hAnsi="Times New Roman"/>
+                <w:b w:val="0"/>
+                <w:i w:val="0"/>
+                <w:color w:val="FF0000"/>
+                <w:sz w:val="26"/>
+              </w:rPr>
+              <w:t>Phản hồi: Đã sửa (Checklist 08)</w:t>
+            </w:r>
+          </w:p>
+        </w:tc>
+      </w:tr>
+      <w:tr>
+        <w:trPr>
+          <w:cantSplit w:val="0"/>
+        </w:trPr>
+        <w:tc>
+          <w:tcPr>
+            <w:tcW w:type="dxa" w:w="907"/>
+            <w:vAlign w:val="top"/>
+            <w:tcMar>
+              <w:top w:w="60" w:type="dxa"/>
+              <w:start w:w="90" w:type="dxa"/>
+              <w:bottom w:w="60" w:type="dxa"/>
+              <w:end w:w="90" w:type="dxa"/>
+            </w:tcMar>
+          </w:tcPr>
+          <w:p>
+            <w:pPr>
+              <w:spacing w:after="0" w:line="240" w:lineRule="auto"/>
+              <w:ind w:firstLine="0" w:left="0"/>
+              <w:jc w:val="center"/>
+            </w:pPr>
+            <w:r/>
+            <w:r>
+              <w:rPr>
+                <w:rFonts w:ascii="Times New Roman" w:hAnsi="Times New Roman"/>
+                <w:b w:val="0"/>
+                <w:i w:val="0"/>
+                <w:sz w:val="26"/>
+              </w:rPr>
               <w:t>M4-01</w:t>
             </w:r>
           </w:p>
@@ -4675,7 +5121,23 @@
           <w:i w:val="0"/>
           <w:sz w:val="28"/>
         </w:rPr>
-        <w:t>- Thể thức: 3 văn bản 0 gợi ý; khối chữ ký không tách trang (đã xem trang PDF); Track Changes hợp lệ, tác giả phân biệt được hai đợt sửa.</w:t>
+        <w:t>- Thể thức: 3 văn bản 0 gợi ý; khối chữ ký không tách trang (đã xem trang PDF); Track Changes hợp lệ, tác giả phân biệt được ba đợt sửa.</w:t>
+      </w:r>
+    </w:p>
+    <w:p>
+      <w:pPr>
+        <w:spacing w:after="60" w:line="276" w:lineRule="auto"/>
+        <w:ind w:firstLine="567"/>
+        <w:jc w:val="both"/>
+      </w:pPr>
+      <w:r>
+        <w:rPr>
+          <w:rFonts w:ascii="Times New Roman" w:hAnsi="Times New Roman"/>
+          <w:b w:val="0"/>
+          <w:i w:val="0"/>
+          <w:sz w:val="28"/>
+        </w:rPr>
+        <w:t>- Quy ước riêng của Trường (Checklist 08, quét lại sau khi sửa cả 4 văn bản): Không có “đảm bảo”; “nhà trường” viết thường đúng vị trí; sau dấu hai chấm, tên đơn vị, chức danh, văn bản viết hoa; tên đơn vị và chữ viết tắt đúng cột (Phòng TH-HC&amp;QT, Phòng QLKHCN&amp;HTPT, Phòng TCCB&amp;CTHSSV trong hành văn; THHCQT ở dòng Lưu); ký thay “KT.”; không ghi học hàm, học vị; phần đầu đúng mẫu 2.1 (Thông báo), 2.2 (hai Báo cáo); ngày ban hành để trống đúng cách.</w:t>
       </w:r>
     </w:p>
     <w:p>
@@ -5227,7 +5689,7 @@
                 <w:i w:val="0"/>
                 <w:sz w:val="26"/>
               </w:rPr>
-              <w:t>8</w:t>
+              <w:t>10</w:t>
             </w:r>
           </w:p>
         </w:tc>
@@ -5256,7 +5718,7 @@
                 <w:i w:val="0"/>
                 <w:sz w:val="26"/>
               </w:rPr>
-              <w:t>8</w:t>
+              <w:t>10</w:t>
             </w:r>
           </w:p>
         </w:tc>
@@ -5314,7 +5776,7 @@
                 <w:i w:val="0"/>
                 <w:sz w:val="26"/>
               </w:rPr>
-              <w:t>M3-01, M3-02 (2); M3-03 đến M3-06 (3); M3-07, M3-08 (4)</w:t>
+              <w:t>M3-01, M3-02 (2); M3-03 đến M3-06 (3); M3-07, M3-08 (4); M3-09, M3-10 (2), (3) — Checklist 08</w:t>
             </w:r>
           </w:p>
         </w:tc>
@@ -5534,7 +5996,7 @@
           <w:i w:val="0"/>
           <w:sz w:val="28"/>
         </w:rPr>
-        <w:t>Bốn văn bản có căn cứ đúng, còn hiệu lực; nội dung thống nhất giữa các văn bản. Rà toàn văn phát hiện 3 vấn đề Mức 2 mà các vòng rà phần sửa trước đó bỏ sót (bảng lệch cột, mô tả mã cảnh báo lỗi thời, mô tả hiệu lực “thay thế” không có trong Quyết định số 2119/QĐ-CĐKT) và 8 vấn đề Mức 3 về viện dẫn lần đầu, mục lục, câu treo — đã sửa hết bằng Track Changes. Các điểm Mức 4 liên quan việc nạp bản gốc văn bản vào kho, không ảnh hưởng tính đúng của căn cứ.</w:t>
+        <w:t>Bốn văn bản có căn cứ đúng, còn hiệu lực; nội dung thống nhất giữa các văn bản. Rà toàn văn phát hiện 3 vấn đề Mức 2 mà các vòng rà phần sửa trước đó bỏ sót (bảng lệch cột, mô tả mã cảnh báo lỗi thời, mô tả hiệu lực “thay thế” không có trong Quyết định số 2119/QĐ-CĐKT) và 10 vấn đề Mức 3 về viện dẫn lần đầu, lần sau (quy ước riêng của Trường), mục lục, câu treo — đã sửa hết bằng Track Changes. Các điểm Mức 4 liên quan việc nạp bản gốc văn bản vào kho, không ảnh hưởng tính đúng của căn cứ.</w:t>
       </w:r>
     </w:p>
     <w:p>

</xml_diff>

<commit_message>
docs: viết hoa chữ đầu sau mọi dấu hai chấm trong 4 văn bản hồ sơ vòng 6 (132 vị trí, Track Changes)
Co-Authored-By: Claude Opus 5.5 <noreply@anthropic.com>
</commit_message>
<xml_diff>
--- a/30-Ket-Qua/2026-09-29/Ho-So-Tham-Dinh-Vong-6/3-Ra-soat-897/BAO-CAO-RA-SOAT-897-CHINH-THUC_Ho-so-KTC-Quan-tri-gui-tham-dinh_20260929.docx
+++ b/30-Ket-Qua/2026-09-29/Ho-So-Tham-Dinh-Vong-6/3-Ra-soat-897/BAO-CAO-RA-SOAT-897-CHINH-THUC_Ho-so-KTC-Quan-tri-gui-tham-dinh_20260929.docx
@@ -3921,6 +3921,229 @@
                 <w:i w:val="0"/>
                 <w:sz w:val="26"/>
               </w:rPr>
+              <w:t>M3-11</w:t>
+            </w:r>
+          </w:p>
+        </w:tc>
+        <w:tc>
+          <w:tcPr>
+            <w:tcW w:type="dxa" w:w="1814"/>
+            <w:vAlign w:val="top"/>
+            <w:tcMar>
+              <w:top w:w="60" w:type="dxa"/>
+              <w:start w:w="90" w:type="dxa"/>
+              <w:bottom w:w="60" w:type="dxa"/>
+              <w:end w:w="90" w:type="dxa"/>
+            </w:tcMar>
+          </w:tcPr>
+          <w:p>
+            <w:pPr>
+              <w:spacing w:after="0" w:line="240" w:lineRule="auto"/>
+              <w:ind w:firstLine="0" w:left="0"/>
+              <w:jc w:val="both"/>
+            </w:pPr>
+            <w:r/>
+            <w:r>
+              <w:rPr>
+                <w:rFonts w:ascii="Times New Roman" w:hAnsi="Times New Roman"/>
+                <w:b w:val="0"/>
+                <w:i w:val="0"/>
+                <w:sz w:val="26"/>
+              </w:rPr>
+              <w:t>(1), (2), (3), (4) — toàn văn, cả trong bảng</w:t>
+            </w:r>
+          </w:p>
+        </w:tc>
+        <w:tc>
+          <w:tcPr>
+            <w:tcW w:type="dxa" w:w="2665"/>
+            <w:vAlign w:val="top"/>
+            <w:tcMar>
+              <w:top w:w="60" w:type="dxa"/>
+              <w:start w:w="90" w:type="dxa"/>
+              <w:bottom w:w="60" w:type="dxa"/>
+              <w:end w:w="90" w:type="dxa"/>
+            </w:tcMar>
+          </w:tcPr>
+          <w:p>
+            <w:pPr>
+              <w:spacing w:after="0" w:line="240" w:lineRule="auto"/>
+              <w:ind w:firstLine="0" w:left="0"/>
+              <w:jc w:val="both"/>
+            </w:pPr>
+            <w:r/>
+            <w:r>
+              <w:rPr>
+                <w:rFonts w:ascii="Times New Roman" w:hAnsi="Times New Roman"/>
+                <w:b w:val="0"/>
+                <w:i w:val="0"/>
+                <w:sz w:val="26"/>
+              </w:rPr>
+              <w:t>“khép kín: Kế hoạch…”, “Điều kiện: Tài khoản…”, “1.1. Mục đích: Hỗ trợ…”, “Ghi nhận: Gói…” (132 vị trí)</w:t>
+            </w:r>
+          </w:p>
+        </w:tc>
+        <w:tc>
+          <w:tcPr>
+            <w:tcW w:type="dxa" w:w="2608"/>
+            <w:vAlign w:val="top"/>
+            <w:tcMar>
+              <w:top w:w="60" w:type="dxa"/>
+              <w:start w:w="90" w:type="dxa"/>
+              <w:bottom w:w="60" w:type="dxa"/>
+              <w:end w:w="90" w:type="dxa"/>
+            </w:tcMar>
+          </w:tcPr>
+          <w:p>
+            <w:pPr>
+              <w:spacing w:after="0" w:line="240" w:lineRule="auto"/>
+              <w:ind w:firstLine="0" w:left="0"/>
+              <w:jc w:val="both"/>
+            </w:pPr>
+            <w:r/>
+            <w:r>
+              <w:rPr>
+                <w:rFonts w:ascii="Times New Roman" w:hAnsi="Times New Roman"/>
+                <w:b w:val="0"/>
+                <w:i w:val="0"/>
+                <w:sz w:val="26"/>
+              </w:rPr>
+              <w:t>Chữ đầu sau dấu hai chấm viết thường</w:t>
+            </w:r>
+          </w:p>
+        </w:tc>
+        <w:tc>
+          <w:tcPr>
+            <w:tcW w:type="dxa" w:w="2041"/>
+            <w:vAlign w:val="top"/>
+            <w:tcMar>
+              <w:top w:w="60" w:type="dxa"/>
+              <w:start w:w="90" w:type="dxa"/>
+              <w:bottom w:w="60" w:type="dxa"/>
+              <w:end w:w="90" w:type="dxa"/>
+            </w:tcMar>
+          </w:tcPr>
+          <w:p>
+            <w:pPr>
+              <w:spacing w:after="0" w:line="240" w:lineRule="auto"/>
+              <w:ind w:firstLine="0" w:left="0"/>
+              <w:jc w:val="both"/>
+            </w:pPr>
+            <w:r/>
+            <w:r>
+              <w:rPr>
+                <w:rFonts w:ascii="Times New Roman" w:hAnsi="Times New Roman"/>
+                <w:b w:val="0"/>
+                <w:i w:val="0"/>
+                <w:sz w:val="26"/>
+              </w:rPr>
+              <w:t>Quy ước viết hoa sau dấu hai chấm của Trường (Checklist 08 mục 2b; bất biến 10 của hệ KTC-Ra-Soat-897)</w:t>
+            </w:r>
+          </w:p>
+        </w:tc>
+        <w:tc>
+          <w:tcPr>
+            <w:tcW w:type="dxa" w:w="1021"/>
+            <w:vAlign w:val="top"/>
+            <w:tcMar>
+              <w:top w:w="60" w:type="dxa"/>
+              <w:start w:w="90" w:type="dxa"/>
+              <w:bottom w:w="60" w:type="dxa"/>
+              <w:end w:w="90" w:type="dxa"/>
+            </w:tcMar>
+          </w:tcPr>
+          <w:p>
+            <w:pPr>
+              <w:spacing w:after="0" w:line="240" w:lineRule="auto"/>
+              <w:ind w:firstLine="0" w:left="0"/>
+              <w:jc w:val="center"/>
+            </w:pPr>
+            <w:r/>
+            <w:r>
+              <w:rPr>
+                <w:rFonts w:ascii="Times New Roman" w:hAnsi="Times New Roman"/>
+                <w:b w:val="0"/>
+                <w:i w:val="0"/>
+                <w:sz w:val="26"/>
+              </w:rPr>
+              <w:t>Mức 3</w:t>
+            </w:r>
+          </w:p>
+        </w:tc>
+        <w:tc>
+          <w:tcPr>
+            <w:tcW w:type="dxa" w:w="3515"/>
+            <w:vAlign w:val="top"/>
+            <w:tcMar>
+              <w:top w:w="60" w:type="dxa"/>
+              <w:start w:w="90" w:type="dxa"/>
+              <w:bottom w:w="60" w:type="dxa"/>
+              <w:end w:w="90" w:type="dxa"/>
+            </w:tcMar>
+          </w:tcPr>
+          <w:p>
+            <w:pPr>
+              <w:spacing w:after="0" w:before="0" w:line="240" w:lineRule="auto"/>
+              <w:jc w:val="both"/>
+            </w:pPr>
+            <w:r/>
+            <w:r>
+              <w:rPr>
+                <w:rFonts w:ascii="Times New Roman" w:hAnsi="Times New Roman"/>
+                <w:b w:val="0"/>
+                <w:i w:val="0"/>
+                <w:sz w:val="26"/>
+              </w:rPr>
+              <w:t>Viết hoa chữ đầu sau mọi dấu hai chấm; trừ giờ phút, đường dẫn web, tên tệp, mã lệnh</w:t>
+            </w:r>
+          </w:p>
+          <w:p>
+            <w:pPr>
+              <w:spacing w:after="0" w:before="80" w:line="240" w:lineRule="auto"/>
+              <w:jc w:val="both"/>
+            </w:pPr>
+            <w:r>
+              <w:rPr>
+                <w:rFonts w:ascii="Times New Roman" w:hAnsi="Times New Roman"/>
+                <w:b w:val="0"/>
+                <w:i w:val="0"/>
+                <w:color w:val="FF0000"/>
+                <w:sz w:val="26"/>
+              </w:rPr>
+              <w:t>Phản hồi: Đã sửa (tác giả “Viết hoa sau dấu hai chấm”); quét lại 0 vị trí</w:t>
+            </w:r>
+          </w:p>
+        </w:tc>
+      </w:tr>
+      <w:tr>
+        <w:trPr>
+          <w:cantSplit w:val="0"/>
+        </w:trPr>
+        <w:tc>
+          <w:tcPr>
+            <w:tcW w:type="dxa" w:w="907"/>
+            <w:vAlign w:val="top"/>
+            <w:tcMar>
+              <w:top w:w="60" w:type="dxa"/>
+              <w:start w:w="90" w:type="dxa"/>
+              <w:bottom w:w="60" w:type="dxa"/>
+              <w:end w:w="90" w:type="dxa"/>
+            </w:tcMar>
+          </w:tcPr>
+          <w:p>
+            <w:pPr>
+              <w:spacing w:after="0" w:line="240" w:lineRule="auto"/>
+              <w:ind w:firstLine="0" w:left="0"/>
+              <w:jc w:val="center"/>
+            </w:pPr>
+            <w:r/>
+            <w:r>
+              <w:rPr>
+                <w:rFonts w:ascii="Times New Roman" w:hAnsi="Times New Roman"/>
+                <w:b w:val="0"/>
+                <w:i w:val="0"/>
+                <w:sz w:val="26"/>
+              </w:rPr>
               <w:t>M4-01</w:t>
             </w:r>
           </w:p>
@@ -5121,7 +5344,7 @@
           <w:i w:val="0"/>
           <w:sz w:val="28"/>
         </w:rPr>
-        <w:t>- Thể thức: 3 văn bản 0 gợi ý; khối chữ ký không tách trang (đã xem trang PDF); Track Changes hợp lệ, tác giả phân biệt được ba đợt sửa.</w:t>
+        <w:t>- Thể thức: 3 văn bản 0 gợi ý; khối chữ ký không tách trang (đã xem trang PDF); Track Changes hợp lệ, tác giả phân biệt được bốn đợt sửa.</w:t>
       </w:r>
     </w:p>
     <w:p>
@@ -5137,7 +5360,7 @@
           <w:i w:val="0"/>
           <w:sz w:val="28"/>
         </w:rPr>
-        <w:t>- Quy ước riêng của Trường (Checklist 08, quét lại sau khi sửa cả 4 văn bản): Không có “đảm bảo”; “nhà trường” viết thường đúng vị trí; sau dấu hai chấm, tên đơn vị, chức danh, văn bản viết hoa; tên đơn vị và chữ viết tắt đúng cột (Phòng TH-HC&amp;QT, Phòng QLKHCN&amp;HTPT, Phòng TCCB&amp;CTHSSV trong hành văn; THHCQT ở dòng Lưu); ký thay “KT.”; không ghi học hàm, học vị; phần đầu đúng mẫu 2.1 (Thông báo), 2.2 (hai Báo cáo); ngày ban hành để trống đúng cách.</w:t>
+        <w:t>- Quy ước riêng của Trường (Checklist 08, quét lại sau khi sửa cả 4 văn bản): Không có “đảm bảo”; “nhà trường” viết thường đúng vị trí; chữ đầu sau mọi dấu hai chấm viết hoa (sau khi sửa M3-11); tên đơn vị và chữ viết tắt đúng cột (Phòng TH-HC&amp;QT, Phòng QLKHCN&amp;HTPT, Phòng TCCB&amp;CTHSSV trong hành văn; THHCQT ở dòng Lưu); ký thay “KT.”; không ghi học hàm, học vị; phần đầu đúng mẫu 2.1 (Thông báo), 2.2 (hai Báo cáo); ngày ban hành để trống đúng cách.</w:t>
       </w:r>
     </w:p>
     <w:p>
@@ -5689,7 +5912,7 @@
                 <w:i w:val="0"/>
                 <w:sz w:val="26"/>
               </w:rPr>
-              <w:t>10</w:t>
+              <w:t>11</w:t>
             </w:r>
           </w:p>
         </w:tc>
@@ -5718,7 +5941,7 @@
                 <w:i w:val="0"/>
                 <w:sz w:val="26"/>
               </w:rPr>
-              <w:t>10</w:t>
+              <w:t>11</w:t>
             </w:r>
           </w:p>
         </w:tc>
@@ -5776,7 +5999,7 @@
                 <w:i w:val="0"/>
                 <w:sz w:val="26"/>
               </w:rPr>
-              <w:t>M3-01, M3-02 (2); M3-03 đến M3-06 (3); M3-07, M3-08 (4); M3-09, M3-10 (2), (3) — Checklist 08</w:t>
+              <w:t>M3-01, M3-02 (2); M3-03 đến M3-06 (3); M3-07, M3-08 (4); M3-09 đến M3-11 — Checklist 08</w:t>
             </w:r>
           </w:p>
         </w:tc>
@@ -5996,7 +6219,7 @@
           <w:i w:val="0"/>
           <w:sz w:val="28"/>
         </w:rPr>
-        <w:t>Bốn văn bản có căn cứ đúng, còn hiệu lực; nội dung thống nhất giữa các văn bản. Rà toàn văn phát hiện 3 vấn đề Mức 2 mà các vòng rà phần sửa trước đó bỏ sót (bảng lệch cột, mô tả mã cảnh báo lỗi thời, mô tả hiệu lực “thay thế” không có trong Quyết định số 2119/QĐ-CĐKT) và 10 vấn đề Mức 3 về viện dẫn lần đầu, lần sau (quy ước riêng của Trường), mục lục, câu treo — đã sửa hết bằng Track Changes. Các điểm Mức 4 liên quan việc nạp bản gốc văn bản vào kho, không ảnh hưởng tính đúng của căn cứ.</w:t>
+        <w:t>Bốn văn bản có căn cứ đúng, còn hiệu lực; nội dung thống nhất giữa các văn bản. Rà toàn văn phát hiện 3 vấn đề Mức 2 mà các vòng rà phần sửa trước đó bỏ sót (bảng lệch cột, mô tả mã cảnh báo lỗi thời, mô tả hiệu lực “thay thế” không có trong Quyết định số 2119/QĐ-CĐKT) và 11 vấn đề Mức 3 về viện dẫn lần đầu, lần sau, viết hoa sau dấu hai chấm (quy ước riêng của Trường), mục lục, câu treo — đã sửa hết bằng Track Changes. Các điểm Mức 4 liên quan việc nạp bản gốc văn bản vào kho, không ảnh hưởng tính đúng của căn cứ.</w:t>
       </w:r>
     </w:p>
     <w:p>

</xml_diff>